<commit_message>
Integration documents: the register holds each query's shape and version today; the SQL text is in the committed query files; SQL text and hash in the register come with the route 4 build
Co-Authored-By: Claude Opus 5.5 <noreply@anthropic.com>
</commit_message>
<xml_diff>
--- a/docs/bootstrap/queries/Data access request - E-Banker read-only access (route 4) - 14 Oct 2026.docx
+++ b/docs/bootstrap/queries/Data access request - E-Banker read-only access (route 4) - 14 Oct 2026.docx
@@ -5326,7 +5326,7 @@
                 <w:i w:val="0"/>
                 <w:sz w:val="17"/>
               </w:rPr>
-              <w:t>The register: the query, its version and the fingerprint of its SQL</w:t>
+              <w:t>The register gives each query and its version; the exact SQL is the committed query file of that version (section 4.2)</w:t>
             </w:r>
           </w:p>
         </w:tc>
@@ -5539,7 +5539,7 @@
           <w:b w:val="0"/>
           <w:i w:val="0"/>
         </w:rPr>
-        <w:t>). This is the RUN 0 that is so often missed by hand. (2) It will bind the watermark as a parameter rather than pasting it into the text, so the statement text, and therefore its fingerprint, stays exactly as registered. (3) It will fetch the result in pages of a few thousand rows, so there is no grid limit and little memory is used on either side. (4) It will write the file and the manifest and land them through the gates.</w:t>
+        <w:t>). This is the RUN 0 that is so often missed by hand. (2) It will bind the watermark as a parameter rather than pasting it into the text, so the statement text, and therefore its fingerprint, stays exactly as approved. (3) It will fetch the result in pages of a few thousand rows, so there is no grid limit and little memory is used on either side. (4) It will write the file and the manifest and land them through the gates.</w:t>
       </w:r>
     </w:p>
     <w:p>
@@ -5588,7 +5588,7 @@
           <w:b w:val="0"/>
           <w:i w:val="0"/>
         </w:rPr>
-        <w:t xml:space="preserve">) is the system's controlled catalogue of every statement it may run against E-Banker. After pack 10 it has </w:t>
+        <w:t xml:space="preserve">) is the system's controlled catalogue of every query it accepts from E-Banker. After pack 10 it has </w:t>
       </w:r>
       <w:r>
         <w:rPr>
@@ -5602,7 +5602,67 @@
           <w:b w:val="0"/>
           <w:i w:val="0"/>
         </w:rPr>
-        <w:t>. It is seeded from the code repository, so it changes only through the release steps in section 2.2. Each entry records the following:</w:t>
+        <w:t>. It is seeded from the code repository (</w:t>
+      </w:r>
+      <w:r>
+        <w:rPr>
+          <w:rFonts w:ascii="Consolas" w:hAnsi="Consolas"/>
+          <w:b w:val="0"/>
+          <w:i w:val="0"/>
+          <w:sz w:val="18"/>
+        </w:rPr>
+        <w:t>database/seeders/EbankerQuerySeeder.php</w:t>
+      </w:r>
+      <w:r>
+        <w:rPr>
+          <w:b w:val="0"/>
+          <w:i w:val="0"/>
+        </w:rPr>
+        <w:t xml:space="preserve">), so it changes only through the release steps in section 2.2. Today each entry records the query's </w:t>
+      </w:r>
+      <w:r>
+        <w:rPr>
+          <w:b/>
+          <w:i w:val="0"/>
+        </w:rPr>
+        <w:t>shape</w:t>
+      </w:r>
+      <w:r>
+        <w:rPr>
+          <w:b w:val="0"/>
+          <w:i w:val="0"/>
+        </w:rPr>
+        <w:t xml:space="preserve">: what it reads, its key, its account and date columns, how it is read, and its version. The </w:t>
+      </w:r>
+      <w:r>
+        <w:rPr>
+          <w:b/>
+          <w:i w:val="0"/>
+        </w:rPr>
+        <w:t>SQL text itself</w:t>
+      </w:r>
+      <w:r>
+        <w:rPr>
+          <w:b w:val="0"/>
+          <w:i w:val="0"/>
+        </w:rPr>
+        <w:t xml:space="preserve"> is kept, by version, in the committed query files under </w:t>
+      </w:r>
+      <w:r>
+        <w:rPr>
+          <w:rFonts w:ascii="Consolas" w:hAnsi="Consolas"/>
+          <w:b w:val="0"/>
+          <w:i w:val="0"/>
+          <w:sz w:val="18"/>
+        </w:rPr>
+        <w:t>docs/bootstrap/queries</w:t>
+      </w:r>
+      <w:r>
+        <w:rPr>
+          <w:b w:val="0"/>
+          <w:i w:val="0"/>
+        </w:rPr>
+        <w:t>, which are what the pack sheets print and what the E-Banker Feed screen hands out as one download. Each entry records the following:</w:t>
       </w:r>
     </w:p>
     <w:tbl>
@@ -6219,7 +6279,7 @@
                 <w:i w:val="0"/>
                 <w:sz w:val="17"/>
               </w:rPr>
-              <w:t>The statement and its SHA-256</w:t>
+              <w:t>Empty today</w:t>
             </w:r>
           </w:p>
         </w:tc>
@@ -6240,7 +6300,7 @@
                 <w:i w:val="0"/>
                 <w:sz w:val="17"/>
               </w:rPr>
-              <w:t>The statement route 4 will execute. The hash proves that a hand-run file came from the registered text</w:t>
+              <w:t>Filled by the route 4 build: the statement route 4 will execute, and its SHA-256, so the system runs exactly the approved text and any change to it shows</w:t>
             </w:r>
           </w:p>
         </w:tc>
@@ -6257,7 +6317,7 @@
           <w:b w:val="0"/>
           <w:i w:val="0"/>
         </w:rPr>
-        <w:t>Under route 1, the register's statements are what the pack sheets print for your team to run in SQL Developer. Under routes 2 and 3, the export script carries the same statements, and under route 4 the system will execute them directly. In every case the same entry governs the same table, so a month read by one route can be compared with a month read by any other.</w:t>
+        <w:t>Under route 1, the committed query files are what the pack sheets print for your team to run in SQL Developer. Under routes 2 and 3, the export script carries the same statements, and under route 4 the system will execute them directly. In every case the same entry governs the same table, so a month read by one route can be compared with a month read by any other.</w:t>
       </w:r>
     </w:p>
     <w:p>
@@ -9559,7 +9619,7 @@
           <w:b w:val="0"/>
           <w:i w:val="0"/>
         </w:rPr>
-        <w:t xml:space="preserve"> The runner will execute only statements from the register (section 4.2) whose SQL fingerprint matches the registered one. It cannot run a statement typed in by hand.</w:t>
+        <w:t xml:space="preserve"> The route 4 build will store each approved statement and its fingerprint in the register (section 4.2). The runner will execute only those statements, and only when the fingerprint still matches. It cannot run a statement typed in by hand.</w:t>
       </w:r>
     </w:p>
     <w:p>
@@ -13298,7 +13358,23 @@
           <w:b w:val="0"/>
           <w:i w:val="0"/>
         </w:rPr>
-        <w:t>) that records, for each query, its identifier (P1_01, P2_08, OD_01 and so on), the E-Banker table it reads and the table's own key column. It also records the account and date columns, a version number, the SQL text and its hash, and whether the table is read incrementally or whole. The register is seeded from the repository, so a query is changed by changing the repository, not by editing a worksheet.</w:t>
+        <w:t xml:space="preserve">) that records, for each query, its identifier (P1_01, P2_08, OD_01 and so on), the E-Banker table it reads and the table's own key column. It also records the account and date columns, a version number, and whether the table is read incrementally or whole. The SQL text of each version is kept in the committed query files under </w:t>
+      </w:r>
+      <w:r>
+        <w:rPr>
+          <w:rFonts w:ascii="Consolas" w:hAnsi="Consolas"/>
+          <w:b w:val="0"/>
+          <w:i w:val="0"/>
+          <w:sz w:val="18"/>
+        </w:rPr>
+        <w:t>docs/bootstrap/queries</w:t>
+      </w:r>
+      <w:r>
+        <w:rPr>
+          <w:b w:val="0"/>
+          <w:i w:val="0"/>
+        </w:rPr>
+        <w:t>; the route 4 build will also store it, with its hash, in the register. Both are in the repository, so a query is changed by changing the repository, not by editing a worksheet.</w:t>
       </w:r>
     </w:p>
     <w:p>
@@ -13421,7 +13497,7 @@
           <w:b w:val="0"/>
           <w:i w:val="0"/>
         </w:rPr>
-        <w:t xml:space="preserve"> gate refuses it, so an old script cannot feed the system unnoticed. The SQL hash lets anyone confirm that the script MAIIC ran is the one in the register.</w:t>
+        <w:t xml:space="preserve"> gate refuses it, so an old script cannot feed the system unnoticed. What the gate checks today is the query's identifier and version as stated in the manifest, not the SQL text itself. Under route 1 the SQL run is the committed file for that version; once the route 4 build stores each statement's hash in the register, the system runs and checks the exact text itself.</w:t>
       </w:r>
     </w:p>
     <w:p>

</xml_diff>